<commit_message>
Resolved remaning issues in the code
</commit_message>
<xml_diff>
--- a/OneIntellectt/docs/One-Intellectt-TDD.docx
+++ b/OneIntellectt/docs/One-Intellectt-TDD.docx
@@ -7886,18 +7886,16 @@
         <w:t>View candidate</w:t>
       </w:r>
       <w:r>
-        <w:t xml:space="preserve"> button that opens </w:t>
+        <w:t xml:space="preserve"> button that opens the portal's </w:t>
       </w:r>
       <w:r>
         <w:rPr>
-          <w:rFonts w:ascii="Consolas" w:hAnsi="Consolas" w:eastAsia="Consolas"/>
-          <w:color w:val="9D174D"/>
-          <w:sz w:val="19"/>
+          <w:b/>
         </w:rPr>
-        <w:t>/candidates/{id}</w:t>
+        <w:t>sign-in page</w:t>
       </w:r>
       <w:r>
-        <w:t xml:space="preserve"> in the portal (</w:t>
+        <w:t xml:space="preserve"> (</w:t>
       </w:r>
       <w:r>
         <w:rPr>
@@ -7908,7 +7906,18 @@
         <w:t>app.frontend.base-url</w:t>
       </w:r>
       <w:r>
-        <w:t xml:space="preserve">); if the person isn't signed in they sign in first and are sent straight to that candidate, where their Approve / Decline buttons are. Sending is asynchronous on the </w:t>
+        <w:t xml:space="preserve"> + </w:t>
+      </w:r>
+      <w:r>
+        <w:rPr>
+          <w:rFonts w:ascii="Consolas" w:hAnsi="Consolas" w:eastAsia="Consolas"/>
+          <w:color w:val="9D174D"/>
+          <w:sz w:val="19"/>
+        </w:rPr>
+        <w:t>/login</w:t>
+      </w:r>
+      <w:r>
+        <w:t xml:space="preserve">, a page that can be opened directly without an account); the person signs in and opens the candidate from their list, where their Approve / Decline buttons are. Sending is asynchronous on the </w:t>
       </w:r>
       <w:r>
         <w:rPr>

</xml_diff>

<commit_message>
Added more filters to search and sending mails if the vendor percentage is higher than a limit
</commit_message>
<xml_diff>
--- a/OneIntellectt/docs/One-Intellectt-TDD.docx
+++ b/OneIntellectt/docs/One-Intellectt-TDD.docx
@@ -3588,7 +3588,7 @@
       <w:r>
         <w:drawing>
           <wp:inline xmlns:a="http://schemas.openxmlformats.org/drawingml/2006/main" xmlns:pic="http://schemas.openxmlformats.org/drawingml/2006/picture">
-            <wp:extent cx="6099048" cy="2997837"/>
+            <wp:extent cx="6099048" cy="3204585"/>
             <wp:docPr id="2" name="Picture 2"/>
             <wp:cNvGraphicFramePr>
               <a:graphicFrameLocks noChangeAspect="1"/>
@@ -3609,7 +3609,7 @@
                   <pic:spPr>
                     <a:xfrm>
                       <a:off x="0" y="0"/>
-                      <a:ext cx="6099048" cy="2997837"/>
+                      <a:ext cx="6099048" cy="3204585"/>
                     </a:xfrm>
                     <a:prstGeom prst="rect"/>
                   </pic:spPr>
@@ -6420,7 +6420,7 @@
         </w:trPr>
         <w:tc>
           <w:tcPr>
-            <w:tcW w:type="dxa" w:w="4689"/>
+            <w:tcW w:type="dxa" w:w="4802"/>
             <w:shd w:val="clear" w:color="auto" w:fill="1E3A8A"/>
           </w:tcPr>
           <w:p>
@@ -6439,7 +6439,7 @@
         </w:tc>
         <w:tc>
           <w:tcPr>
-            <w:tcW w:type="dxa" w:w="4915"/>
+            <w:tcW w:type="dxa" w:w="4802"/>
             <w:shd w:val="clear" w:color="auto" w:fill="1E3A8A"/>
           </w:tcPr>
           <w:p>
@@ -6463,7 +6463,7 @@
         </w:trPr>
         <w:tc>
           <w:tcPr>
-            <w:tcW w:type="dxa" w:w="4689"/>
+            <w:tcW w:type="dxa" w:w="4802"/>
           </w:tcPr>
           <w:p>
             <w:pPr>
@@ -6479,7 +6479,7 @@
         </w:tc>
         <w:tc>
           <w:tcPr>
-            <w:tcW w:type="dxa" w:w="4915"/>
+            <w:tcW w:type="dxa" w:w="4802"/>
           </w:tcPr>
           <w:p>
             <w:pPr>
@@ -6513,7 +6513,7 @@
         </w:trPr>
         <w:tc>
           <w:tcPr>
-            <w:tcW w:type="dxa" w:w="4689"/>
+            <w:tcW w:type="dxa" w:w="4802"/>
             <w:shd w:val="clear" w:color="auto" w:fill="F1F5F9"/>
           </w:tcPr>
           <w:p>
@@ -6530,7 +6530,7 @@
         </w:tc>
         <w:tc>
           <w:tcPr>
-            <w:tcW w:type="dxa" w:w="4915"/>
+            <w:tcW w:type="dxa" w:w="4802"/>
             <w:shd w:val="clear" w:color="auto" w:fill="F1F5F9"/>
           </w:tcPr>
           <w:p>
@@ -6642,7 +6642,7 @@
         </w:trPr>
         <w:tc>
           <w:tcPr>
-            <w:tcW w:type="dxa" w:w="4689"/>
+            <w:tcW w:type="dxa" w:w="4802"/>
           </w:tcPr>
           <w:p>
             <w:pPr>
@@ -6658,7 +6658,7 @@
         </w:tc>
         <w:tc>
           <w:tcPr>
-            <w:tcW w:type="dxa" w:w="4915"/>
+            <w:tcW w:type="dxa" w:w="4802"/>
           </w:tcPr>
           <w:p>
             <w:pPr>
@@ -6687,7 +6687,7 @@
         </w:trPr>
         <w:tc>
           <w:tcPr>
-            <w:tcW w:type="dxa" w:w="4689"/>
+            <w:tcW w:type="dxa" w:w="4802"/>
             <w:shd w:val="clear" w:color="auto" w:fill="F1F5F9"/>
           </w:tcPr>
           <w:p>
@@ -6704,7 +6704,7 @@
         </w:tc>
         <w:tc>
           <w:tcPr>
-            <w:tcW w:type="dxa" w:w="4915"/>
+            <w:tcW w:type="dxa" w:w="4802"/>
             <w:shd w:val="clear" w:color="auto" w:fill="F1F5F9"/>
           </w:tcPr>
           <w:p>
@@ -6803,7 +6803,7 @@
         </w:trPr>
         <w:tc>
           <w:tcPr>
-            <w:tcW w:type="dxa" w:w="4689"/>
+            <w:tcW w:type="dxa" w:w="4802"/>
           </w:tcPr>
           <w:p>
             <w:pPr>
@@ -6819,7 +6819,7 @@
         </w:tc>
         <w:tc>
           <w:tcPr>
-            <w:tcW w:type="dxa" w:w="4915"/>
+            <w:tcW w:type="dxa" w:w="4802"/>
           </w:tcPr>
           <w:p>
             <w:pPr>
@@ -6848,7 +6848,7 @@
         </w:trPr>
         <w:tc>
           <w:tcPr>
-            <w:tcW w:type="dxa" w:w="4689"/>
+            <w:tcW w:type="dxa" w:w="4802"/>
             <w:shd w:val="clear" w:color="auto" w:fill="F1F5F9"/>
           </w:tcPr>
           <w:p>
@@ -6865,7 +6865,7 @@
         </w:tc>
         <w:tc>
           <w:tcPr>
-            <w:tcW w:type="dxa" w:w="4915"/>
+            <w:tcW w:type="dxa" w:w="4802"/>
             <w:shd w:val="clear" w:color="auto" w:fill="F1F5F9"/>
           </w:tcPr>
           <w:p>
@@ -6901,7 +6901,7 @@
         </w:trPr>
         <w:tc>
           <w:tcPr>
-            <w:tcW w:type="dxa" w:w="4689"/>
+            <w:tcW w:type="dxa" w:w="4802"/>
           </w:tcPr>
           <w:p>
             <w:pPr>
@@ -6917,7 +6917,7 @@
         </w:tc>
         <w:tc>
           <w:tcPr>
-            <w:tcW w:type="dxa" w:w="4915"/>
+            <w:tcW w:type="dxa" w:w="4802"/>
           </w:tcPr>
           <w:p>
             <w:pPr>
@@ -7002,7 +7002,7 @@
         </w:trPr>
         <w:tc>
           <w:tcPr>
-            <w:tcW w:type="dxa" w:w="4689"/>
+            <w:tcW w:type="dxa" w:w="4802"/>
             <w:shd w:val="clear" w:color="auto" w:fill="F1F5F9"/>
           </w:tcPr>
           <w:p>
@@ -7019,7 +7019,7 @@
         </w:tc>
         <w:tc>
           <w:tcPr>
-            <w:tcW w:type="dxa" w:w="4915"/>
+            <w:tcW w:type="dxa" w:w="4802"/>
             <w:shd w:val="clear" w:color="auto" w:fill="F1F5F9"/>
           </w:tcPr>
           <w:p>
@@ -7041,7 +7041,7 @@
         </w:trPr>
         <w:tc>
           <w:tcPr>
-            <w:tcW w:type="dxa" w:w="4689"/>
+            <w:tcW w:type="dxa" w:w="4802"/>
           </w:tcPr>
           <w:p>
             <w:pPr>
@@ -7057,7 +7057,7 @@
         </w:tc>
         <w:tc>
           <w:tcPr>
-            <w:tcW w:type="dxa" w:w="4915"/>
+            <w:tcW w:type="dxa" w:w="4802"/>
           </w:tcPr>
           <w:p>
             <w:pPr>
@@ -7142,7 +7142,7 @@
         </w:trPr>
         <w:tc>
           <w:tcPr>
-            <w:tcW w:type="dxa" w:w="4689"/>
+            <w:tcW w:type="dxa" w:w="4802"/>
             <w:shd w:val="clear" w:color="auto" w:fill="F1F5F9"/>
           </w:tcPr>
           <w:p>
@@ -7159,7 +7159,7 @@
         </w:tc>
         <w:tc>
           <w:tcPr>
-            <w:tcW w:type="dxa" w:w="4915"/>
+            <w:tcW w:type="dxa" w:w="4802"/>
             <w:shd w:val="clear" w:color="auto" w:fill="F1F5F9"/>
           </w:tcPr>
           <w:p>
@@ -7222,7 +7222,7 @@
         </w:trPr>
         <w:tc>
           <w:tcPr>
-            <w:tcW w:type="dxa" w:w="4689"/>
+            <w:tcW w:type="dxa" w:w="4802"/>
           </w:tcPr>
           <w:p>
             <w:pPr>
@@ -7238,7 +7238,7 @@
         </w:tc>
         <w:tc>
           <w:tcPr>
-            <w:tcW w:type="dxa" w:w="4915"/>
+            <w:tcW w:type="dxa" w:w="4802"/>
           </w:tcPr>
           <w:p>
             <w:pPr>
@@ -7259,7 +7259,7 @@
         </w:trPr>
         <w:tc>
           <w:tcPr>
-            <w:tcW w:type="dxa" w:w="4689"/>
+            <w:tcW w:type="dxa" w:w="4802"/>
             <w:shd w:val="clear" w:color="auto" w:fill="F1F5F9"/>
           </w:tcPr>
           <w:p>
@@ -7276,7 +7276,7 @@
         </w:tc>
         <w:tc>
           <w:tcPr>
-            <w:tcW w:type="dxa" w:w="4915"/>
+            <w:tcW w:type="dxa" w:w="4802"/>
             <w:shd w:val="clear" w:color="auto" w:fill="F1F5F9"/>
           </w:tcPr>
           <w:p>
@@ -7356,7 +7356,7 @@
         </w:trPr>
         <w:tc>
           <w:tcPr>
-            <w:tcW w:type="dxa" w:w="4689"/>
+            <w:tcW w:type="dxa" w:w="4802"/>
           </w:tcPr>
           <w:p>
             <w:pPr>
@@ -7372,7 +7372,7 @@
         </w:tc>
         <w:tc>
           <w:tcPr>
-            <w:tcW w:type="dxa" w:w="4915"/>
+            <w:tcW w:type="dxa" w:w="4802"/>
           </w:tcPr>
           <w:p>
             <w:pPr>
@@ -7457,7 +7457,7 @@
         </w:trPr>
         <w:tc>
           <w:tcPr>
-            <w:tcW w:type="dxa" w:w="4689"/>
+            <w:tcW w:type="dxa" w:w="4802"/>
             <w:shd w:val="clear" w:color="auto" w:fill="F1F5F9"/>
           </w:tcPr>
           <w:p>
@@ -7474,7 +7474,7 @@
         </w:tc>
         <w:tc>
           <w:tcPr>
-            <w:tcW w:type="dxa" w:w="4915"/>
+            <w:tcW w:type="dxa" w:w="4802"/>
             <w:shd w:val="clear" w:color="auto" w:fill="F1F5F9"/>
           </w:tcPr>
           <w:p>
@@ -7560,23 +7560,30 @@
         </w:trPr>
         <w:tc>
           <w:tcPr>
-            <w:tcW w:type="dxa" w:w="4689"/>
-          </w:tcPr>
-          <w:p>
-            <w:pPr>
-              <w:spacing w:after="0"/>
-            </w:pPr>
-            <w:r>
-              <w:rPr>
-                <w:sz w:val="18"/>
-              </w:rPr>
-              <w:t>Super Admin override</w:t>
-            </w:r>
-          </w:p>
-        </w:tc>
-        <w:tc>
-          <w:tcPr>
-            <w:tcW w:type="dxa" w:w="4915"/>
+            <w:tcW w:type="dxa" w:w="4802"/>
+          </w:tcPr>
+          <w:p>
+            <w:pPr>
+              <w:spacing w:after="0"/>
+            </w:pPr>
+            <w:r>
+              <w:rPr>
+                <w:b/>
+                <w:sz w:val="18"/>
+              </w:rPr>
+              <w:t>Vendor percentage above 75%</w:t>
+            </w:r>
+            <w:r>
+              <w:rPr>
+                <w:sz w:val="18"/>
+              </w:rPr>
+              <w:t xml:space="preserve"> (a separate "Warning" email, sent when the Sales Lead / Manager approves and when the rates change; nothing at 75% or less)</w:t>
+            </w:r>
+          </w:p>
+        </w:tc>
+        <w:tc>
+          <w:tcPr>
+            <w:tcW w:type="dxa" w:w="4802"/>
           </w:tcPr>
           <w:p>
             <w:pPr>
@@ -7616,7 +7623,7 @@
                 <w:color w:val="9D174D"/>
                 <w:sz w:val="16"/>
               </w:rPr>
-              <w:t>accounts@</w:t>
+              <w:t>payroll@</w:t>
             </w:r>
             <w:r>
               <w:rPr>
@@ -7630,13 +7637,13 @@
                 <w:color w:val="9D174D"/>
                 <w:sz w:val="16"/>
               </w:rPr>
-              <w:t>payroll@</w:t>
-            </w:r>
-            <w:r>
-              <w:rPr>
-                <w:sz w:val="18"/>
-              </w:rPr>
-              <w:t xml:space="preserve">, the Sales Lead and Manager + </w:t>
+              <w:t>accounts@</w:t>
+            </w:r>
+            <w:r>
+              <w:rPr>
+                <w:sz w:val="18"/>
+              </w:rPr>
+              <w:t xml:space="preserve">, the Lead, the Manager, the recruiter + </w:t>
             </w:r>
             <w:r>
               <w:rPr>
@@ -7645,6 +7652,12 @@
                 <w:sz w:val="16"/>
               </w:rPr>
               <w:t>superadmin@</w:t>
+            </w:r>
+            <w:r>
+              <w:rPr>
+                <w:sz w:val="18"/>
+              </w:rPr>
+              <w:t>; says the vendor percentage is greater than 75% and to look into it</w:t>
             </w:r>
           </w:p>
         </w:tc>
@@ -7655,7 +7668,7 @@
         </w:trPr>
         <w:tc>
           <w:tcPr>
-            <w:tcW w:type="dxa" w:w="4689"/>
+            <w:tcW w:type="dxa" w:w="4802"/>
             <w:shd w:val="clear" w:color="auto" w:fill="F1F5F9"/>
           </w:tcPr>
           <w:p>
@@ -7666,14 +7679,109 @@
               <w:rPr>
                 <w:sz w:val="18"/>
               </w:rPr>
+              <w:t>Super Admin override</w:t>
+            </w:r>
+          </w:p>
+        </w:tc>
+        <w:tc>
+          <w:tcPr>
+            <w:tcW w:type="dxa" w:w="4802"/>
+            <w:shd w:val="clear" w:color="auto" w:fill="F1F5F9"/>
+          </w:tcPr>
+          <w:p>
+            <w:pPr>
+              <w:spacing w:after="0"/>
+            </w:pPr>
+            <w:r>
+              <w:rPr>
+                <w:rFonts w:ascii="Consolas" w:hAnsi="Consolas" w:eastAsia="Consolas"/>
+                <w:color w:val="9D174D"/>
+                <w:sz w:val="16"/>
+              </w:rPr>
+              <w:t>hr@</w:t>
+            </w:r>
+            <w:r>
+              <w:rPr>
+                <w:sz w:val="18"/>
+              </w:rPr>
+              <w:t xml:space="preserve">, </w:t>
+            </w:r>
+            <w:r>
+              <w:rPr>
+                <w:rFonts w:ascii="Consolas" w:hAnsi="Consolas" w:eastAsia="Consolas"/>
+                <w:color w:val="9D174D"/>
+                <w:sz w:val="16"/>
+              </w:rPr>
+              <w:t>contracts@</w:t>
+            </w:r>
+            <w:r>
+              <w:rPr>
+                <w:sz w:val="18"/>
+              </w:rPr>
+              <w:t xml:space="preserve">, </w:t>
+            </w:r>
+            <w:r>
+              <w:rPr>
+                <w:rFonts w:ascii="Consolas" w:hAnsi="Consolas" w:eastAsia="Consolas"/>
+                <w:color w:val="9D174D"/>
+                <w:sz w:val="16"/>
+              </w:rPr>
+              <w:t>accounts@</w:t>
+            </w:r>
+            <w:r>
+              <w:rPr>
+                <w:sz w:val="18"/>
+              </w:rPr>
+              <w:t xml:space="preserve">, </w:t>
+            </w:r>
+            <w:r>
+              <w:rPr>
+                <w:rFonts w:ascii="Consolas" w:hAnsi="Consolas" w:eastAsia="Consolas"/>
+                <w:color w:val="9D174D"/>
+                <w:sz w:val="16"/>
+              </w:rPr>
+              <w:t>payroll@</w:t>
+            </w:r>
+            <w:r>
+              <w:rPr>
+                <w:sz w:val="18"/>
+              </w:rPr>
+              <w:t xml:space="preserve">, the Sales Lead and Manager + </w:t>
+            </w:r>
+            <w:r>
+              <w:rPr>
+                <w:rFonts w:ascii="Consolas" w:hAnsi="Consolas" w:eastAsia="Consolas"/>
+                <w:color w:val="9D174D"/>
+                <w:sz w:val="16"/>
+              </w:rPr>
+              <w:t>superadmin@</w:t>
+            </w:r>
+          </w:p>
+        </w:tc>
+      </w:tr>
+      <w:tr>
+        <w:trPr>
+          <w:cantSplit w:val="true"/>
+        </w:trPr>
+        <w:tc>
+          <w:tcPr>
+            <w:tcW w:type="dxa" w:w="4802"/>
+          </w:tcPr>
+          <w:p>
+            <w:pPr>
+              <w:spacing w:after="0"/>
+            </w:pPr>
+            <w:r>
+              <w:rPr>
+                <w:sz w:val="18"/>
+              </w:rPr>
               <w:t>Password reset</w:t>
             </w:r>
           </w:p>
         </w:tc>
         <w:tc>
           <w:tcPr>
-            <w:tcW w:type="dxa" w:w="4915"/>
-            <w:shd w:val="clear" w:color="auto" w:fill="F1F5F9"/>
+            <w:tcW w:type="dxa" w:w="4802"/>
           </w:tcPr>
           <w:p>
             <w:pPr>
@@ -8350,6 +8458,211 @@
       </w:r>
       <w:r>
         <w:t>). Candidates that were declined, rejected or dropped out are not counted.</w:t>
+      </w:r>
+    </w:p>
+    <w:p>
+      <w:pPr>
+        <w:pStyle w:val="Heading2"/>
+      </w:pPr>
+      <w:r>
+        <w:t>4.6a Change history</w:t>
+      </w:r>
+    </w:p>
+    <w:p>
+      <w:r>
+        <w:t xml:space="preserve">Every HR edit and every rate change is saved on the candidate's approval trail with </w:t>
+      </w:r>
+      <w:r>
+        <w:rPr>
+          <w:b/>
+        </w:rPr>
+        <w:t>who</w:t>
+      </w:r>
+      <w:r>
+        <w:t xml:space="preserve"> made it (name and role), </w:t>
+      </w:r>
+      <w:r>
+        <w:rPr>
+          <w:b/>
+        </w:rPr>
+        <w:t>when</w:t>
+      </w:r>
+      <w:r>
+        <w:t xml:space="preserve">, and each changed field as *old → new* (e.g. Pay rate 80 → 90; for a rate change also the reason). The candidate page shows them in a </w:t>
+      </w:r>
+      <w:r>
+        <w:rPr>
+          <w:b/>
+        </w:rPr>
+        <w:t>Change history</w:t>
+      </w:r>
+      <w:r>
+        <w:t xml:space="preserve"> card (newest first, the old value struck through) next to the full trail, to everyone who can open the candidate (recruiter, Lead, Manager, HR, Contracts, Payroll, Accounts, Super Admin). A Job Description edit only says "changed" (the text is long) and an SSN change only says "SSN changed" (never shown). No schema change.</w:t>
+      </w:r>
+    </w:p>
+    <w:p>
+      <w:pPr>
+        <w:pStyle w:val="Heading2"/>
+      </w:pPr>
+      <w:r>
+        <w:t>4.6b Super Admin dashboard filters</w:t>
+      </w:r>
+    </w:p>
+    <w:p>
+      <w:r>
+        <w:t xml:space="preserve">The Super Admin dashboard has a </w:t>
+      </w:r>
+      <w:r>
+        <w:rPr>
+          <w:b/>
+        </w:rPr>
+        <w:t>Filters</w:t>
+      </w:r>
+      <w:r>
+        <w:t xml:space="preserve"> card: which date to use (submitted, last updated, date of joining, project end date), a quick range (today, this/last week, this/last month, last 30 days; weeks run Monday to Sunday) or custom dates, recruiter, team, employment type, placement entity, payroll company, client state and recruiter location. The six counters and the candidate table follow the same filters. They are optional query parameters of </w:t>
+      </w:r>
+      <w:r>
+        <w:rPr>
+          <w:rFonts w:ascii="Consolas" w:hAnsi="Consolas" w:eastAsia="Consolas"/>
+          <w:color w:val="9D174D"/>
+          <w:sz w:val="19"/>
+        </w:rPr>
+        <w:t>GET /api/candidates</w:t>
+      </w:r>
+      <w:r>
+        <w:t xml:space="preserve"> and </w:t>
+      </w:r>
+      <w:r>
+        <w:rPr>
+          <w:rFonts w:ascii="Consolas" w:hAnsi="Consolas" w:eastAsia="Consolas"/>
+          <w:color w:val="9D174D"/>
+          <w:sz w:val="19"/>
+        </w:rPr>
+        <w:t>/summary</w:t>
+      </w:r>
+      <w:r>
+        <w:t xml:space="preserve"> (</w:t>
+      </w:r>
+      <w:r>
+        <w:rPr>
+          <w:rFonts w:ascii="Consolas" w:hAnsi="Consolas" w:eastAsia="Consolas"/>
+          <w:color w:val="9D174D"/>
+          <w:sz w:val="19"/>
+        </w:rPr>
+        <w:t>dateField</w:t>
+      </w:r>
+      <w:r>
+        <w:t xml:space="preserve">, </w:t>
+      </w:r>
+      <w:r>
+        <w:rPr>
+          <w:rFonts w:ascii="Consolas" w:hAnsi="Consolas" w:eastAsia="Consolas"/>
+          <w:color w:val="9D174D"/>
+          <w:sz w:val="19"/>
+        </w:rPr>
+        <w:t>from</w:t>
+      </w:r>
+      <w:r>
+        <w:t xml:space="preserve">, </w:t>
+      </w:r>
+      <w:r>
+        <w:rPr>
+          <w:rFonts w:ascii="Consolas" w:hAnsi="Consolas" w:eastAsia="Consolas"/>
+          <w:color w:val="9D174D"/>
+          <w:sz w:val="19"/>
+        </w:rPr>
+        <w:t>to</w:t>
+      </w:r>
+      <w:r>
+        <w:t xml:space="preserve">, </w:t>
+      </w:r>
+      <w:r>
+        <w:rPr>
+          <w:rFonts w:ascii="Consolas" w:hAnsi="Consolas" w:eastAsia="Consolas"/>
+          <w:color w:val="9D174D"/>
+          <w:sz w:val="19"/>
+        </w:rPr>
+        <w:t>recruiterId</w:t>
+      </w:r>
+      <w:r>
+        <w:t xml:space="preserve">, </w:t>
+      </w:r>
+      <w:r>
+        <w:rPr>
+          <w:rFonts w:ascii="Consolas" w:hAnsi="Consolas" w:eastAsia="Consolas"/>
+          <w:color w:val="9D174D"/>
+          <w:sz w:val="19"/>
+        </w:rPr>
+        <w:t>teamId</w:t>
+      </w:r>
+      <w:r>
+        <w:t xml:space="preserve">, </w:t>
+      </w:r>
+      <w:r>
+        <w:rPr>
+          <w:rFonts w:ascii="Consolas" w:hAnsi="Consolas" w:eastAsia="Consolas"/>
+          <w:color w:val="9D174D"/>
+          <w:sz w:val="19"/>
+        </w:rPr>
+        <w:t>employmentType</w:t>
+      </w:r>
+      <w:r>
+        <w:t xml:space="preserve">, </w:t>
+      </w:r>
+      <w:r>
+        <w:rPr>
+          <w:rFonts w:ascii="Consolas" w:hAnsi="Consolas" w:eastAsia="Consolas"/>
+          <w:color w:val="9D174D"/>
+          <w:sz w:val="19"/>
+        </w:rPr>
+        <w:t>internalEntity</w:t>
+      </w:r>
+      <w:r>
+        <w:t xml:space="preserve">, </w:t>
+      </w:r>
+      <w:r>
+        <w:rPr>
+          <w:rFonts w:ascii="Consolas" w:hAnsi="Consolas" w:eastAsia="Consolas"/>
+          <w:color w:val="9D174D"/>
+          <w:sz w:val="19"/>
+        </w:rPr>
+        <w:t>clientState</w:t>
+      </w:r>
+      <w:r>
+        <w:t xml:space="preserve">, </w:t>
+      </w:r>
+      <w:r>
+        <w:rPr>
+          <w:rFonts w:ascii="Consolas" w:hAnsi="Consolas" w:eastAsia="Consolas"/>
+          <w:color w:val="9D174D"/>
+          <w:sz w:val="19"/>
+        </w:rPr>
+        <w:t>recruiterLocation</w:t>
+      </w:r>
+      <w:r>
+        <w:t xml:space="preserve">, </w:t>
+      </w:r>
+      <w:r>
+        <w:rPr>
+          <w:rFonts w:ascii="Consolas" w:hAnsi="Consolas" w:eastAsia="Consolas"/>
+          <w:color w:val="9D174D"/>
+          <w:sz w:val="19"/>
+        </w:rPr>
+        <w:t>payrollCompany</w:t>
+      </w:r>
+      <w:r>
+        <w:t xml:space="preserve">; </w:t>
+      </w:r>
+      <w:r>
+        <w:rPr>
+          <w:rFonts w:ascii="Consolas" w:hAnsi="Consolas" w:eastAsia="Consolas"/>
+          <w:color w:val="9D174D"/>
+          <w:sz w:val="19"/>
+        </w:rPr>
+        <w:t>service/CandidateFilter</w:t>
+      </w:r>
+      <w:r>
+        <w:t>). They are bound as query parameters, a bad date type or range is a 400, and the caller's visibility rules always apply on top, so a filter can't show anything the person may not see. No schema change.</w:t>
       </w:r>
     </w:p>
     <w:p>
@@ -10674,7 +10987,7 @@
               <w:rPr>
                 <w:sz w:val="18"/>
               </w:rPr>
-              <w:t>Auth &amp; sessions, users &amp; teams, full workflow incl. Sales Manager / Payroll / Accounts, paging/filters, audit, attacks, role matrix, compliance controls, rate change, project end date</w:t>
+              <w:t>Auth &amp; sessions, users &amp; teams, full workflow incl. Sales Manager / Payroll / Accounts, paging/filters, audit, attacks, role matrix, compliance controls, rate change, project end date, vendor-percentage warning, dashboard filters</w:t>
             </w:r>
           </w:p>
         </w:tc>

</xml_diff>

<commit_message>
Added More Visa types and Emp types
</commit_message>
<xml_diff>
--- a/OneIntellectt/docs/One-Intellectt-TDD.docx
+++ b/OneIntellectt/docs/One-Intellectt-TDD.docx
@@ -8315,7 +8315,7 @@
               <w:rPr>
                 <w:sz w:val="18"/>
               </w:rPr>
-              <w:t xml:space="preserve"> (W2, C2C, Full-time, Self), </w:t>
+              <w:t xml:space="preserve"> (W2, C2C, Full-time, Self, 1099 Individual, Other), </w:t>
             </w:r>
             <w:r>
               <w:rPr>
@@ -8367,7 +8367,7 @@
               <w:rPr>
                 <w:sz w:val="18"/>
               </w:rPr>
-              <w:t xml:space="preserve"> (pay rate ÷ bill rate × 100, using the discounted bill rate when there is a discount; worked out, never stored), start date, DOJ (optional), CC company (optional), referral (optional), referral amount (optional), SSN (optional), visa status, work authorization expiry (</w:t>
+              <w:t xml:space="preserve"> (pay rate ÷ bill rate × 100, using the discounted bill rate when there is a discount; worked out, never stored), start date, DOJ (optional), CC company (optional), referral (optional), referral amount (optional), SSN (optional), visa status (US Citizen, Green Card, H1 Transfer, H1 Ext, H1 Amd, H1 Amd+Ext, H1 No Change, H4 EAD, L2 EAD, OPT, STEM OPT, CPT, TN, Other), work authorization expiry (</w:t>
             </w:r>
             <w:r>
               <w:rPr>

</xml_diff>